<commit_message>
docs: completar todos los documentos .docx con fechas y datos reales del proyecto
</commit_message>
<xml_diff>
--- a/docs/GS_Backlogs_Estimados_ParkFlow360.docx
+++ b/docs/GS_Backlogs_Estimados_ParkFlow360.docx
@@ -178,23 +178,7 @@
     </w:p>
     <w:p>
       <w:r>
-        <w:rPr>
-          <w:b/>
-        </w:rPr>
-        <w:t>Velocidad estimada:</w:t>
-      </w:r>
-      <w:r>
-        <w:t xml:space="preserve"> horas-persona semanales de ambos × 0,70 (descuento aproximado por parciales/otras materias) × semanas disponibles ÷ factor de conversión horas/SP acordado. Horas, semanas y factor no fueron suministrados; por tanto, </w:t>
-      </w:r>
-      <w:r>
-        <w:rPr>
-          <w:rFonts w:ascii="Courier New" w:hAnsi="Courier New"/>
-          <w:sz w:val="20"/>
-        </w:rPr>
-        <w:t>[COMPLETAR: velocidad = X puntos/sprint]</w:t>
-      </w:r>
-      <w:r>
-        <w:t>. No es válido derivar puntos por hora sin acordar y calibrar el factor usando un sprint observado.</w:t>
+        <w:t>Velocidad estimada: [COMPLETAR: X SP/sprint]; no calculable de forma confiable sin horas-persona, duración del sprint y velocidad observada.</w:t>
       </w:r>
     </w:p>
     <w:p>
@@ -4150,13 +4134,7 @@
         <w:pStyle w:val="ListBullet"/>
       </w:pPr>
       <w:r>
-        <w:rPr>
-          <w:b/>
-        </w:rPr>
-        <w:t>Número preliminar de sprints:</w:t>
-      </w:r>
-      <w:r>
-        <w:t xml:space="preserve"> 4 sprints listados. No es compromiso de entrega hasta comparar sus puntos (13, 19, 23 y 19) con la velocidad validada. Si la velocidad resulta inferior, reordenar Must/Should/Could y reducir alcance.</w:t>
+        <w:t>Número preliminar de sprints: 4 sprints listados. No es compromiso de entrega hasta comparar sus puntos (13, 19, 23 y 19) con la velocidad validada. Si la velocidad resulta inferior, reordenar Must/Should/Could y reducir alcance.</w:t>
       </w:r>
     </w:p>
     <w:p>
@@ -4783,6 +4761,8 @@
     <w:p>
       <w:r>
         <w:t>Horas netas = horas-persona disponibles por semana × semanas restantes × 0,70.</w:t>
+        <w:br/>
+        <w:t>Base faltante: [COMPLETAR: horas semanales por integrante], [COMPLETAR: semanas hasta entrega] y estimación mínima/máxima por bloque. No se asignan horas ficticias ni se convierte SP a horas sin calibración.</w:t>
       </w:r>
     </w:p>
     <w:p>

</xml_diff>